<commit_message>
Site updated: 2024-06-08 07:24:22
</commit_message>
<xml_diff>
--- a/treasure/download/杂藏-139部/史传部-96部/续高僧传-唐-道宣.docx
+++ b/treasure/download/杂藏-139部/史传部-96部/续高僧传-唐-道宣.docx
@@ -12785,7 +12785,16 @@
           <w:shd w:val="pct15" w:color="auto" w:fill="FFFFFF"/>
           <w:lang w:eastAsia="zh-CN"/>
         </w:rPr>
-        <w:t xml:space="preserve">　　释。智远。姓王族。本太原寓居陕服。幼而聪颖早悟非常。居荆州长沙寺禅坊。为法京沙门之弟子也。卓然独立靖记玄心。至于戒年清洁逾厉而慧业未深。遥想扬辇遂负[袌-包+矢]沿波达于建业。龙光僧绰一代英雄。乃肆心仰旨专门受教。学逾一纪。解通三藏。梁建安侯萧正立。务兼内外兼弘孔释。造普明寺请远居之。以伸供养之志也。有慧湛禅师。定品惟深晚学宗领。遂具受秘法咨质玄观。定水既澄慧门宜敞。及研习大乘洞其根叶。又历名山养志弘道。与沙门道会同集龙盘。夙昔素心一期开决。因住开善毕志山泉。城阙不窥世华无涉。守静自怡年老无舍。以陈太建三年十二月一日旦。终于此寺禅坊。时年七十有七。遗旨不令哭。奄如入定。乃窆于独龙之山。新安寺沙门慧皓曰。吾与伊人早同法门久禀戒道。叹法桥之忽坏痛宝舟之已沈。乃率庸才仰传实德。五兵尚书萧济。鸿才硕学行洁名高为之铭颂。</w:t>
+        <w:t xml:space="preserve">　　释</w:t>
+      </w:r>
+      <w:r>
+        <w:rPr>
+          <w:sz w:val="24"/>
+          <w:szCs w:val="24"/>
+          <w:shd w:val="pct15" w:color="auto" w:fill="FFFFFF"/>
+          <w:lang w:eastAsia="zh-CN"/>
+        </w:rPr>
+        <w:t>智远。姓王族。本太原寓居陕服。幼而聪颖早悟非常。居荆州长沙寺禅坊。为法京沙门之弟子也。卓然独立靖记玄心。至于戒年清洁逾厉而慧业未深。遥想扬辇遂负[袌-包+矢]沿波达于建业。龙光僧绰一代英雄。乃肆心仰旨专门受教。学逾一纪。解通三藏。梁建安侯萧正立。务兼内外兼弘孔释。造普明寺请远居之。以伸供养之志也。有慧湛禅师。定品惟深晚学宗领。遂具受秘法咨质玄观。定水既澄慧门宜敞。及研习大乘洞其根叶。又历名山养志弘道。与沙门道会同集龙盘。夙昔素心一期开决。因住开善毕志山泉。城阙不窥世华无涉。守静自怡年老无舍。以陈太建三年十二月一日旦。终于此寺禅坊。时年七十有七。遗旨不令哭。奄如入定。乃窆于独龙之山。新安寺沙门慧皓曰。吾与伊人早同法门久禀戒道。叹法桥之忽坏痛宝舟之已沈。乃率庸才仰传实德。五兵尚书萧济。鸿才硕学行洁名高为之铭颂。</w:t>
       </w:r>
     </w:p>
     <w:p>
@@ -21286,8 +21295,6 @@
         </w:rPr>
         <w:t>（乂）</w:t>
       </w:r>
-      <w:bookmarkStart w:id="0" w:name="_GoBack"/>
-      <w:bookmarkEnd w:id="0"/>
       <w:r>
         <w:rPr>
           <w:sz w:val="24"/>
@@ -27398,7 +27405,26 @@
           <w:lang w:eastAsia="zh-CN"/>
         </w:rPr>
         <w:lastRenderedPageBreak/>
-        <w:t>次第传灯于今扬化)冲公自从经术。专以楞伽命家。前后敷弘将二百遍。须便为引。曾未涉文。而通变适缘。寄势陶诱。得意如一。随言便异。师学者苦请出义。乃告曰。义者。道理也。言说已粗。况舒在纸粗中之粗矣。事不获已作疏五卷。题为私记。今盛行之。初冲周行东川。不任官贯。频有度次。高让不受。年将知命有敕度人。兖州度抑令入度。隶州部法集寺虽名预公贯而栖泉石抚接遗逸为心房公位居台辅。作书召入。冲得题背曰。我于三界无所须。卿至三槐位亦极。公又重延。不守恒度。翻翔都邑。即弘大法晟动英髦。冠盖云蒸叹未曾有。中书杜正伦。亲位法席。详评玄义。弘福润法师初未相识。曰何处老大德。答兖州老小僧耳。又问何为远至。答曰。闻此少一乘。欲宣一乘教网漉信地鱼龙故至。润曰。斯实大心开士也。因行至大兴善寺。万年令郑钦泰。于寺打人。冲止之曰。公勿于寺打人。泰曰。打人罪我自当。冲曰。道不自当可遣他受。然国家立寺。本欲安宁社稷。唯善行之。公今于寺打人。岂名为国祈福。泰即礼谢。又三藏玄奘不许讲旧所翻经。冲曰。君依旧经出家。若不许弘旧经者。君可还俗。更依新翻经出家。方许君此意。奘闻遂止。斯亦命代弘经护法强御之士。不可及也。然冲一生游道为务。曾无栖泊。仆射于志宁曰。此法师乃法界头陀僧也。不可名实拘之。显庆年言旋东夏。至今麟德年七十九矣。</w:t>
+        <w:t>次第传灯于今扬化)冲公自从经术。专以楞伽命家。前后敷弘将二百遍。须便为引。曾未涉文。而通变适缘。寄势陶诱。得意如一。随言便异。师学者苦请出义。乃告曰。义者。道理也。言说已粗。况舒在纸粗中之粗矣。事不获已作疏五卷。题为私记。今盛行之。初冲周行东川。不任官贯。频有度次。高让不受。年将知命有敕度人。兖州度抑令入度。隶州部法集寺虽名预公贯而栖泉石抚接遗逸为心房公位居台辅。作书召入。冲得题背曰。我于三界无所须。卿至三槐位亦极。公又重延。不守恒度。翻翔都邑。即弘大法晟动英髦。冠盖云蒸叹未曾有。中书杜正伦。亲位法席。详评玄义。弘福润法师初未相识。曰何处老大德。答兖州老小僧耳。又问何为远至。答曰。闻此少一乘。欲宣一乘教网漉信地鱼龙故至。润曰。斯实大心开士也。因行至大兴善寺。万年令郑钦泰。于寺打人。冲止之曰。公勿于寺打人。泰曰。打人罪我自当。冲曰。道不自当可遣他受。然国家立寺。本欲安宁社稷。唯善行之。公今于寺打人。岂名为国祈福。泰即礼谢。</w:t>
+      </w:r>
+      <w:r>
+        <w:rPr>
+          <w:color w:val="00B0F0"/>
+          <w:sz w:val="24"/>
+          <w:szCs w:val="24"/>
+          <w:shd w:val="pct15" w:color="auto" w:fill="FFFFFF"/>
+          <w:lang w:eastAsia="zh-CN"/>
+        </w:rPr>
+        <w:t>又三藏玄奘不许讲旧所翻经。冲曰。君依旧经出家。若不许弘旧经者。君可还俗。更依新翻经出家。方许君此意。奘闻遂止。</w:t>
+      </w:r>
+      <w:r>
+        <w:rPr>
+          <w:sz w:val="24"/>
+          <w:szCs w:val="24"/>
+          <w:shd w:val="pct15" w:color="auto" w:fill="FFFFFF"/>
+          <w:lang w:eastAsia="zh-CN"/>
+        </w:rPr>
+        <w:t>斯亦命代弘经护法强御之士。不可及也。然冲一生游道为务。曾无栖泊。仆射于志宁曰。此法师乃法界头陀僧也。不可名实拘之。显庆年言旋东夏。至今麟德年七十九矣。</w:t>
       </w:r>
     </w:p>
     <w:p>
@@ -28728,7 +28754,27 @@
           <w:shd w:val="pct15" w:color="auto" w:fill="FFFFFF"/>
           <w:lang w:eastAsia="zh-CN"/>
         </w:rPr>
-        <w:t xml:space="preserve">　　释明芬。相州人。齐三藏耶舍之神足也。通解方俗妙识梵言。传度幽旨莫匪喉舌。开皇之译。下敕追延。令与梵僧对传法本。而意专捡失好住空闲。味咏十地言辄引据。问论清巧通滞罕伦。仁寿下敕。令置塔于慈州之石窟寺。寺即齐文宣之所立也。大窟像背文宣陵藏中诸雕刻骇动人鬼。芬引舍利去州三十许里。白云郁起从寺至舆长引不绝。耿耿横空中有天仙飞腾往返。竟日方灭。明旦将晓还有白云长引来迎。云中天仙如昨无异。人众同见倾目叵论。识者以为石窟之与鼓山连接密尔。竹林仙圣响应之乎。既至山塔。东面有泉。众生饮皆病愈。芬后卒于兴善。所著众经。如费氏录。</w:t>
+        <w:t xml:space="preserve">　　释明芬。相州人。齐</w:t>
+      </w:r>
+      <w:bookmarkStart w:id="0" w:name="_GoBack"/>
+      <w:r>
+        <w:rPr>
+          <w:sz w:val="24"/>
+          <w:szCs w:val="24"/>
+          <w:shd w:val="pct15" w:color="auto" w:fill="FFFFFF"/>
+          <w:lang w:eastAsia="zh-CN"/>
+        </w:rPr>
+        <w:t>三藏</w:t>
+      </w:r>
+      <w:bookmarkEnd w:id="0"/>
+      <w:r>
+        <w:rPr>
+          <w:sz w:val="24"/>
+          <w:szCs w:val="24"/>
+          <w:shd w:val="pct15" w:color="auto" w:fill="FFFFFF"/>
+          <w:lang w:eastAsia="zh-CN"/>
+        </w:rPr>
+        <w:t>耶舍之神足也。通解方俗妙识梵言。传度幽旨莫匪喉舌。开皇之译。下敕追延。令与梵僧对传法本。而意专捡失好住空闲。味咏十地言辄引据。问论清巧通滞罕伦。仁寿下敕。令置塔于慈州之石窟寺。寺即齐文宣之所立也。大窟像背文宣陵藏中诸雕刻骇动人鬼。芬引舍利去州三十许里。白云郁起从寺至舆长引不绝。耿耿横空中有天仙飞腾往返。竟日方灭。明旦将晓还有白云长引来迎。云中天仙如昨无异。人众同见倾目叵论。识者以为石窟之与鼓山连接密尔。竹林仙圣响应之乎。既至山塔。东面有泉。众生饮皆病愈。芬后卒于兴善。所著众经。如费氏录。</w:t>
       </w:r>
     </w:p>
     <w:p>
@@ -45190,7 +45236,7 @@
 </file>
 
 <file path=customXml/itemProps1.xml><?xml version="1.0" encoding="utf-8"?>
-<ds:datastoreItem xmlns:ds="http://schemas.openxmlformats.org/officeDocument/2006/customXml" ds:itemID="{63EE7D3D-ECA0-4AF4-B2C3-12C6A2FDDC84}">
+<ds:datastoreItem xmlns:ds="http://schemas.openxmlformats.org/officeDocument/2006/customXml" ds:itemID="{FBAC1511-AD19-450A-BA6E-8EBF490FF53C}">
   <ds:schemaRefs>
     <ds:schemaRef ds:uri="http://schemas.openxmlformats.org/officeDocument/2006/bibliography"/>
   </ds:schemaRefs>

</xml_diff>